<commit_message>
docs: align project documentation with latest features
</commit_message>
<xml_diff>
--- a/docs/data-model/SMF_Travel_Modello_Logico_Dati_v1.3.docx
+++ b/docs/data-model/SMF_Travel_Modello_Logico_Dati_v1.3.docx
@@ -14444,6 +14444,493 @@
       </w:pPr>
       <w:r>
         <w:t>BR-IAM-01: l'email è un recapito, lo username è l'identificatore di accesso; il consumo di un invito non invalida quelli associati ad altri utenti.</w:t>
+      </w:r>
+    </w:p>
+    <w:p>
+      <w:r>
+        <w:br w:type="page"/>
+      </w:r>
+    </w:p>
+    <w:p>
+      <w:pPr>
+        <w:pStyle w:val="Heading1"/>
+        <w:keepNext/>
+        <w:spacing w:before="0" w:after="40"/>
+      </w:pPr>
+      <w:r>
+        <w:t>Addendum logico 2026-09-02 - profili Paese e qualita AI</w:t>
+      </w:r>
+    </w:p>
+    <w:p>
+      <w:pPr>
+        <w:spacing w:before="0" w:after="40"/>
+      </w:pPr>
+      <w:r>
+        <w:rPr>
+          <w:b/>
+          <w:color w:val="0A6F6C"/>
+          <w:sz w:val="17"/>
+        </w:rPr>
+        <w:t>Aggiornamento as-built: 2 settembre 2026</w:t>
+      </w:r>
+    </w:p>
+    <w:p>
+      <w:pPr>
+        <w:pStyle w:val="Heading2"/>
+        <w:keepNext/>
+        <w:spacing w:before="0" w:after="40"/>
+      </w:pPr>
+      <w:r>
+        <w:t>Nuove entita e significati</w:t>
+      </w:r>
+    </w:p>
+    <w:tbl>
+      <w:tblPr>
+        <w:tblStyle w:val="TableGrid"/>
+        <w:tblW w:type="auto" w:w="0"/>
+        <w:tblLayout w:type="autofit"/>
+        <w:tblLook w:firstColumn="1" w:firstRow="1" w:lastColumn="0" w:lastRow="0" w:noHBand="0" w:noVBand="1" w:val="04A0"/>
+      </w:tblPr>
+      <w:tblGrid>
+        <w:gridCol w:w="3120"/>
+        <w:gridCol w:w="3120"/>
+        <w:gridCol w:w="3120"/>
+      </w:tblGrid>
+      <w:tr>
+        <w:tc>
+          <w:tcPr>
+            <w:tcW w:type="dxa" w:w="3120"/>
+            <w:shd w:fill="D9EDE9"/>
+          </w:tcPr>
+          <w:p>
+            <w:pPr>
+              <w:spacing w:before="0" w:after="0"/>
+            </w:pPr>
+            <w:r>
+              <w:rPr>
+                <w:b/>
+                <w:color w:val="0F413E"/>
+                <w:sz w:val="17"/>
+              </w:rPr>
+              <w:t>Entita logica</w:t>
+            </w:r>
+          </w:p>
+        </w:tc>
+        <w:tc>
+          <w:tcPr>
+            <w:tcW w:type="dxa" w:w="3120"/>
+            <w:shd w:fill="D9EDE9"/>
+          </w:tcPr>
+          <w:p>
+            <w:pPr>
+              <w:spacing w:before="0" w:after="0"/>
+            </w:pPr>
+            <w:r>
+              <w:rPr>
+                <w:b/>
+                <w:color w:val="0F413E"/>
+                <w:sz w:val="17"/>
+              </w:rPr>
+              <w:t>Significato</w:t>
+            </w:r>
+          </w:p>
+        </w:tc>
+        <w:tc>
+          <w:tcPr>
+            <w:tcW w:type="dxa" w:w="3120"/>
+            <w:shd w:fill="D9EDE9"/>
+          </w:tcPr>
+          <w:p>
+            <w:pPr>
+              <w:spacing w:before="0" w:after="0"/>
+            </w:pPr>
+            <w:r>
+              <w:rPr>
+                <w:b/>
+                <w:color w:val="0F413E"/>
+                <w:sz w:val="17"/>
+              </w:rPr>
+              <w:t>Ownership</w:t>
+            </w:r>
+          </w:p>
+        </w:tc>
+      </w:tr>
+      <w:tr>
+        <w:tc>
+          <w:tcPr>
+            <w:tcW w:type="dxa" w:w="3120"/>
+          </w:tcPr>
+          <w:p>
+            <w:pPr>
+              <w:spacing w:before="0" w:after="0"/>
+            </w:pPr>
+            <w:r>
+              <w:rPr>
+                <w:sz w:val="17"/>
+              </w:rPr>
+              <w:t>Profilo Paese</w:t>
+            </w:r>
+          </w:p>
+        </w:tc>
+        <w:tc>
+          <w:tcPr>
+            <w:tcW w:type="dxa" w:w="3120"/>
+          </w:tcPr>
+          <w:p>
+            <w:pPr>
+              <w:spacing w:before="0" w:after="0"/>
+            </w:pPr>
+            <w:r>
+              <w:rPr>
+                <w:sz w:val="17"/>
+              </w:rPr>
+              <w:t>Versione strutturata delle informazioni sensibili con fonte, validita e disclaimer.</w:t>
+            </w:r>
+          </w:p>
+        </w:tc>
+        <w:tc>
+          <w:tcPr>
+            <w:tcW w:type="dxa" w:w="3120"/>
+          </w:tcPr>
+          <w:p>
+            <w:pPr>
+              <w:spacing w:before="0" w:after="0"/>
+            </w:pPr>
+            <w:r>
+              <w:rPr>
+                <w:sz w:val="17"/>
+              </w:rPr>
+              <w:t>Stewardship piattaforma; consumo tenant.</w:t>
+            </w:r>
+          </w:p>
+        </w:tc>
+      </w:tr>
+      <w:tr>
+        <w:tc>
+          <w:tcPr>
+            <w:tcW w:type="dxa" w:w="3120"/>
+          </w:tcPr>
+          <w:p>
+            <w:pPr>
+              <w:spacing w:before="0" w:after="0"/>
+            </w:pPr>
+            <w:r>
+              <w:rPr>
+                <w:sz w:val="17"/>
+              </w:rPr>
+              <w:t>Revisione profilo Paese per agenzia</w:t>
+            </w:r>
+          </w:p>
+        </w:tc>
+        <w:tc>
+          <w:tcPr>
+            <w:tcW w:type="dxa" w:w="3120"/>
+          </w:tcPr>
+          <w:p>
+            <w:pPr>
+              <w:spacing w:before="0" w:after="0"/>
+            </w:pPr>
+            <w:r>
+              <w:rPr>
+                <w:sz w:val="17"/>
+              </w:rPr>
+              <w:t>Decisione approvato/respinto riferita a una specifica versione.</w:t>
+            </w:r>
+          </w:p>
+        </w:tc>
+        <w:tc>
+          <w:tcPr>
+            <w:tcW w:type="dxa" w:w="3120"/>
+          </w:tcPr>
+          <w:p>
+            <w:pPr>
+              <w:spacing w:before="0" w:after="0"/>
+            </w:pPr>
+            <w:r>
+              <w:rPr>
+                <w:sz w:val="17"/>
+              </w:rPr>
+              <w:t>Responsabile dell'agenzia.</w:t>
+            </w:r>
+          </w:p>
+        </w:tc>
+      </w:tr>
+      <w:tr>
+        <w:tc>
+          <w:tcPr>
+            <w:tcW w:type="dxa" w:w="3120"/>
+          </w:tcPr>
+          <w:p>
+            <w:pPr>
+              <w:spacing w:before="0" w:after="0"/>
+            </w:pPr>
+            <w:r>
+              <w:rPr>
+                <w:sz w:val="17"/>
+              </w:rPr>
+              <w:t>Evidenza di estrazione preventivo</w:t>
+            </w:r>
+          </w:p>
+        </w:tc>
+        <w:tc>
+          <w:tcPr>
+            <w:tcW w:type="dxa" w:w="3120"/>
+          </w:tcPr>
+          <w:p>
+            <w:pPr>
+              <w:spacing w:before="0" w:after="0"/>
+            </w:pPr>
+            <w:r>
+              <w:rPr>
+                <w:sz w:val="17"/>
+              </w:rPr>
+              <w:t>Collegamento tra campo strutturato e porzione del documento di origine.</w:t>
+            </w:r>
+          </w:p>
+        </w:tc>
+        <w:tc>
+          <w:tcPr>
+            <w:tcW w:type="dxa" w:w="3120"/>
+          </w:tcPr>
+          <w:p>
+            <w:pPr>
+              <w:spacing w:before="0" w:after="0"/>
+            </w:pPr>
+            <w:r>
+              <w:rPr>
+                <w:sz w:val="17"/>
+              </w:rPr>
+              <w:t>Agenzia proprietaria del viaggio.</w:t>
+            </w:r>
+          </w:p>
+        </w:tc>
+      </w:tr>
+      <w:tr>
+        <w:tc>
+          <w:tcPr>
+            <w:tcW w:type="dxa" w:w="3120"/>
+          </w:tcPr>
+          <w:p>
+            <w:pPr>
+              <w:spacing w:before="0" w:after="0"/>
+            </w:pPr>
+            <w:r>
+              <w:rPr>
+                <w:sz w:val="17"/>
+              </w:rPr>
+              <w:t>Descrizione semantica fotografica</w:t>
+            </w:r>
+          </w:p>
+        </w:tc>
+        <w:tc>
+          <w:tcPr>
+            <w:tcW w:type="dxa" w:w="3120"/>
+          </w:tcPr>
+          <w:p>
+            <w:pPr>
+              <w:spacing w:before="0" w:after="0"/>
+            </w:pPr>
+            <w:r>
+              <w:rPr>
+                <w:sz w:val="17"/>
+              </w:rPr>
+              <w:t>Criteri privati usati dall'AI per riconoscere soggetto, luogo o tema.</w:t>
+            </w:r>
+          </w:p>
+        </w:tc>
+        <w:tc>
+          <w:tcPr>
+            <w:tcW w:type="dxa" w:w="3120"/>
+          </w:tcPr>
+          <w:p>
+            <w:pPr>
+              <w:spacing w:before="0" w:after="0"/>
+            </w:pPr>
+            <w:r>
+              <w:rPr>
+                <w:sz w:val="17"/>
+              </w:rPr>
+              <w:t>Template/versione del viaggio.</w:t>
+            </w:r>
+          </w:p>
+        </w:tc>
+      </w:tr>
+      <w:tr>
+        <w:tc>
+          <w:tcPr>
+            <w:tcW w:type="dxa" w:w="3120"/>
+          </w:tcPr>
+          <w:p>
+            <w:pPr>
+              <w:spacing w:before="0" w:after="0"/>
+            </w:pPr>
+            <w:r>
+              <w:rPr>
+                <w:sz w:val="17"/>
+              </w:rPr>
+              <w:t>Giudizio fotografico</w:t>
+            </w:r>
+          </w:p>
+        </w:tc>
+        <w:tc>
+          <w:tcPr>
+            <w:tcW w:type="dxa" w:w="3120"/>
+          </w:tcPr>
+          <w:p>
+            <w:pPr>
+              <w:spacing w:before="0" w:after="0"/>
+            </w:pPr>
+            <w:r>
+              <w:rPr>
+                <w:sz w:val="17"/>
+              </w:rPr>
+              <w:t>Esito, punteggi di categoria, motivazione e timestamp.</w:t>
+            </w:r>
+          </w:p>
+        </w:tc>
+        <w:tc>
+          <w:tcPr>
+            <w:tcW w:type="dxa" w:w="3120"/>
+          </w:tcPr>
+          <w:p>
+            <w:pPr>
+              <w:spacing w:before="0" w:after="0"/>
+            </w:pPr>
+            <w:r>
+              <w:rPr>
+                <w:sz w:val="17"/>
+              </w:rPr>
+              <w:t>Viaggiatore e ambito gruppo/viaggio.</w:t>
+            </w:r>
+          </w:p>
+        </w:tc>
+      </w:tr>
+    </w:tbl>
+    <w:p>
+      <w:pPr>
+        <w:spacing w:before="0" w:after="40"/>
+      </w:pPr>
+    </w:p>
+    <w:p>
+      <w:pPr>
+        <w:pStyle w:val="Heading2"/>
+        <w:keepNext/>
+        <w:spacing w:before="0" w:after="40"/>
+      </w:pPr>
+      <w:r>
+        <w:t>Relazioni e cardinalita</w:t>
+      </w:r>
+    </w:p>
+    <w:p>
+      <w:pPr>
+        <w:pStyle w:val="ListBullet"/>
+        <w:spacing w:before="0" w:after="40"/>
+      </w:pPr>
+      <w:r>
+        <w:rPr>
+          <w:sz w:val="17"/>
+        </w:rPr>
+        <w:t>Agenzia 1:N Revisione profilo Paese; Paese 1:N Versione profilo; Versione profilo 1:N Revisioni di agenzia.</w:t>
+      </w:r>
+    </w:p>
+    <w:p>
+      <w:pPr>
+        <w:pStyle w:val="ListBullet"/>
+        <w:spacing w:before="0" w:after="40"/>
+      </w:pPr>
+      <w:r>
+        <w:rPr>
+          <w:sz w:val="17"/>
+        </w:rPr>
+        <w:t>La chiave naturale della decisione e (agenzia, Paese, versione). Per la stessa combinazione esiste al massimo una decisione corrente.</w:t>
+      </w:r>
+    </w:p>
+    <w:p>
+      <w:pPr>
+        <w:pStyle w:val="ListBullet"/>
+        <w:spacing w:before="0" w:after="40"/>
+      </w:pPr>
+      <w:r>
+        <w:rPr>
+          <w:sz w:val="17"/>
+        </w:rPr>
+        <w:t>Un template di viaggio usa uno o piu Paesi; soltanto questi possono comparire nella coda di revisione dell'agenzia.</w:t>
+      </w:r>
+    </w:p>
+    <w:p>
+      <w:pPr>
+        <w:pStyle w:val="ListBullet"/>
+        <w:spacing w:before="0" w:after="40"/>
+      </w:pPr>
+      <w:r>
+        <w:rPr>
+          <w:sz w:val="17"/>
+        </w:rPr>
+        <w:t>Un obiettivo fotografico appartiene a una missione, casella bingo o contest; ogni tentativo produce al massimo un giudizio AI persistito.</w:t>
+      </w:r>
+    </w:p>
+    <w:p>
+      <w:pPr>
+        <w:pStyle w:val="Heading2"/>
+        <w:keepNext/>
+        <w:spacing w:before="0" w:after="40"/>
+      </w:pPr>
+      <w:r>
+        <w:t>Regole di business aggiunte</w:t>
+      </w:r>
+    </w:p>
+    <w:p>
+      <w:pPr>
+        <w:pStyle w:val="ListBullet"/>
+        <w:spacing w:before="0" w:after="40"/>
+      </w:pPr>
+      <w:r>
+        <w:rPr>
+          <w:sz w:val="17"/>
+        </w:rPr>
+        <w:t>Il superuser non e data steward dei contenuti sensibili per conto dell'agenzia e non puo approvare una versione.</w:t>
+      </w:r>
+    </w:p>
+    <w:p>
+      <w:pPr>
+        <w:pStyle w:val="ListBullet"/>
+        <w:spacing w:before="0" w:after="40"/>
+      </w:pPr>
+      <w:r>
+        <w:rPr>
+          <w:sz w:val="17"/>
+        </w:rPr>
+        <w:t>L'approvazione di una versione non si propaga tra agenzie e non sopravvive a una nuova versione del profilo.</w:t>
+      </w:r>
+    </w:p>
+    <w:p>
+      <w:pPr>
+        <w:pStyle w:val="ListBullet"/>
+        <w:spacing w:before="0" w:after="40"/>
+      </w:pPr>
+      <w:r>
+        <w:rPr>
+          <w:sz w:val="17"/>
+        </w:rPr>
+        <w:t>La pubblicazione richiede un profilo approvato nel medesimo tenant; il retry deve essere idempotente.</w:t>
+      </w:r>
+    </w:p>
+    <w:p>
+      <w:pPr>
+        <w:pStyle w:val="ListBullet"/>
+        <w:spacing w:before="0" w:after="40"/>
+      </w:pPr>
+      <w:r>
+        <w:rPr>
+          <w:sz w:val="17"/>
+        </w:rPr>
+        <w:t>Le descrizioni semantiche AI sono dati interni e non sono mostrate al viaggiatore.</w:t>
+      </w:r>
+      <w:r>
+        <w:rPr>
+          <w:sz w:val="17"/>
+        </w:rPr>
+        <w:t xml:space="preserve"> Le foto fuori tema non possono diventare candidate o vincitrici; a parita prevale il timestamp piu antico.</w:t>
       </w:r>
     </w:p>
     <w:sectPr>

</xml_diff>